<commit_message>
Rà soát mẫu BVDLCN (đợt 2): cam kết 14 bám BLLĐ Đ125.2, Đ129; phụ lục 15 không làm chậm thông báo vi phạm; thống nhất vị trí lưu trữ, thời hạn ảnh CCCD, thuật ngữ tiếng Anh
Co-Authored-By: Claude Opus 5.5 <noreply@anthropic.com>
Claude-Session: https://claude.ai/code/session_01EYfrLZFALxho7iwpK7bTVa
</commit_message>
<xml_diff>
--- a/templates/08-bo-mau-cap-1-2/14-cam-ket-bao-mat-du-lieu-nhan-su.docx
+++ b/templates/08-bo-mau-cap-1-2/14-cam-ket-bao-mat-du-lieu-nhan-su.docx
@@ -2589,7 +2589,7 @@
           <w:sz w:val="26"/>
           <w:szCs w:val="26"/>
         </w:rPr>
-        <w:t xml:space="preserve">c) Không tự điều tra, không xóa dấu vết, không tự liên hệ bên ngoài; làm theo hướng dẫn của người xử lý sự cố.</w:t>
+        <w:t xml:space="preserve">c) Không tự điều tra, không xóa dấu vết, không tự liên hệ bên ngoài; làm theo hướng dẫn của người xử lý sự cố. Điều này không hạn chế quyền của tôi thông báo, phản ánh với cơ quan nhà nước có thẩm quyền theo quy định của pháp luật.</w:t>
       </w:r>
     </w:p>
     <w:p>
@@ -2867,7 +2867,7 @@
           <w:szCs w:val="26"/>
           <w:highlight w:val="yellow"/>
         </w:rPr>
-        <w:t xml:space="preserve">camera tại sảnh và cửa ra vào; máy chấm công bằng thẻ từ; ghi nhật ký đăng nhập, truy cập các hệ thống thông tin; lọc thư điện tử chống thư rác, mã độc, lừa đảo</w:t>
+        <w:t xml:space="preserve">camera tại sảnh và cửa ra vào; máy chấm công bằng thẻ từ; ghi nhật ký đăng nhập, truy cập các hệ thống thông tin và tên miền truy cập Internet; lọc thư điện tử chống thư rác, mã độc, lừa đảo</w:t>
       </w:r>
       <w:r>
         <w:rPr>
@@ -3091,26 +3091,26 @@
           <w:sz w:val="26"/>
           <w:szCs w:val="26"/>
         </w:rPr>
-        <w:t xml:space="preserve"> và Bộ luật Lao động (Điều 124, khoản 2 Điều 125), kể cả sa thải nếu tiết lộ bí mật kinh doanh, bí mật công nghệ của Công ty (với cộng tác viên, nhân sự nhà cung cấp: theo hợp đồng đã ký).</w:t>
-      </w:r>
-    </w:p>
-    <w:p>
-      <w:pPr>
-        <w:spacing w:after="120" w:before="0" w:line="276" w:lineRule="auto"/>
-        <w:ind w:firstLine="566"/>
-        <w:jc w:val="both"/>
-      </w:pPr>
-      <w:r>
-        <w:rPr>
-          <w:rFonts w:ascii="Times New Roman" w:cs="Times New Roman" w:eastAsia="Times New Roman" w:hAnsi="Times New Roman"/>
-          <w:b w:val="false"/>
-          <w:bCs w:val="false"/>
-          <w:i w:val="false"/>
-          <w:iCs w:val="false"/>
-          <w:sz w:val="26"/>
-          <w:szCs w:val="26"/>
-        </w:rPr>
-        <w:t xml:space="preserve">b) Tôi phải bồi thường thiệt hại do mình gây ra theo quy định của pháp luật và nội quy lao động (Điều 129 Bộ luật Lao động); bồi thường theo thỏa thuận bảo vệ bí mật kinh doanh, bí mật công nghệ nếu có (khoản 2 Điều 21 Bộ luật Lao động).</w:t>
+        <w:t xml:space="preserve"> và Bộ luật Lao động (Điều 124, khoản 2 Điều 125), kể cả sa thải nếu tiết lộ bí mật kinh doanh, bí mật công nghệ của Công ty và hành vi này được quy định trong nội quy lao động (với cộng tác viên, nhân sự nhà cung cấp: theo hợp đồng đã ký).</w:t>
+      </w:r>
+    </w:p>
+    <w:p>
+      <w:pPr>
+        <w:spacing w:after="120" w:before="0" w:line="276" w:lineRule="auto"/>
+        <w:ind w:firstLine="566"/>
+        <w:jc w:val="both"/>
+      </w:pPr>
+      <w:r>
+        <w:rPr>
+          <w:rFonts w:ascii="Times New Roman" w:cs="Times New Roman" w:eastAsia="Times New Roman" w:hAnsi="Times New Roman"/>
+          <w:b w:val="false"/>
+          <w:bCs w:val="false"/>
+          <w:i w:val="false"/>
+          <w:iCs w:val="false"/>
+          <w:sz w:val="26"/>
+          <w:szCs w:val="26"/>
+        </w:rPr>
+        <w:t xml:space="preserve">b) Tôi phải bồi thường thiệt hại do mình gây ra theo quy định của pháp luật hoặc nội quy lao động (Điều 129 Bộ luật Lao động); bồi thường theo thỏa thuận bảo vệ bí mật kinh doanh, bí mật công nghệ nếu có (khoản 2 Điều 21 Bộ luật Lao động).</w:t>
       </w:r>
     </w:p>
     <w:p>

</xml_diff>